<commit_message>
Update screenshots for evidence
</commit_message>
<xml_diff>
--- a/screenshots/screenshots for evidence.docx
+++ b/screenshots/screenshots for evidence.docx
@@ -54,7 +54,7 @@
                     <pic:cNvPicPr/>
                   </pic:nvPicPr>
                   <pic:blipFill>
-                    <a:blip r:embed="rId4"/>
+                    <a:blip r:embed="rId5"/>
                     <a:stretch>
                       <a:fillRect/>
                     </a:stretch>
@@ -118,7 +118,7 @@
                     <pic:cNvPicPr/>
                   </pic:nvPicPr>
                   <pic:blipFill>
-                    <a:blip r:embed="rId5"/>
+                    <a:blip r:embed="rId6"/>
                     <a:stretch>
                       <a:fillRect/>
                     </a:stretch>
@@ -873,7 +873,7 @@
                     <pic:cNvPicPr/>
                   </pic:nvPicPr>
                   <pic:blipFill>
-                    <a:blip r:embed="rId6"/>
+                    <a:blip r:embed="rId7"/>
                     <a:stretch>
                       <a:fillRect/>
                     </a:stretch>
@@ -969,7 +969,7 @@
                     <pic:cNvPicPr/>
                   </pic:nvPicPr>
                   <pic:blipFill>
-                    <a:blip r:embed="rId7"/>
+                    <a:blip r:embed="rId8"/>
                     <a:stretch>
                       <a:fillRect/>
                     </a:stretch>
@@ -1035,7 +1035,7 @@
                     <pic:cNvPicPr/>
                   </pic:nvPicPr>
                   <pic:blipFill>
-                    <a:blip r:embed="rId8"/>
+                    <a:blip r:embed="rId9"/>
                     <a:stretch>
                       <a:fillRect/>
                     </a:stretch>
@@ -1115,7 +1115,7 @@
                     <pic:cNvPicPr/>
                   </pic:nvPicPr>
                   <pic:blipFill>
-                    <a:blip r:embed="rId9"/>
+                    <a:blip r:embed="rId10"/>
                     <a:stretch>
                       <a:fillRect/>
                     </a:stretch>
@@ -1235,7 +1235,7 @@
                     <pic:cNvPicPr/>
                   </pic:nvPicPr>
                   <pic:blipFill>
-                    <a:blip r:embed="rId10"/>
+                    <a:blip r:embed="rId11"/>
                     <a:stretch>
                       <a:fillRect/>
                     </a:stretch>
@@ -1291,7 +1291,7 @@
                     <pic:cNvPicPr/>
                   </pic:nvPicPr>
                   <pic:blipFill>
-                    <a:blip r:embed="rId11"/>
+                    <a:blip r:embed="rId12"/>
                     <a:stretch>
                       <a:fillRect/>
                     </a:stretch>
@@ -1364,7 +1364,7 @@
                     <pic:cNvPicPr/>
                   </pic:nvPicPr>
                   <pic:blipFill>
-                    <a:blip r:embed="rId12"/>
+                    <a:blip r:embed="rId13"/>
                     <a:stretch>
                       <a:fillRect/>
                     </a:stretch>
@@ -1404,7 +1404,7 @@
                     <pic:cNvPicPr/>
                   </pic:nvPicPr>
                   <pic:blipFill>
-                    <a:blip r:embed="rId13"/>
+                    <a:blip r:embed="rId14"/>
                     <a:stretch>
                       <a:fillRect/>
                     </a:stretch>
@@ -1444,7 +1444,7 @@
                     <pic:cNvPicPr/>
                   </pic:nvPicPr>
                   <pic:blipFill>
-                    <a:blip r:embed="rId14"/>
+                    <a:blip r:embed="rId15"/>
                     <a:stretch>
                       <a:fillRect/>
                     </a:stretch>
@@ -1500,7 +1500,7 @@
                     <pic:cNvPicPr/>
                   </pic:nvPicPr>
                   <pic:blipFill>
-                    <a:blip r:embed="rId15"/>
+                    <a:blip r:embed="rId16"/>
                     <a:stretch>
                       <a:fillRect/>
                     </a:stretch>
@@ -1540,7 +1540,7 @@
                     <pic:cNvPicPr/>
                   </pic:nvPicPr>
                   <pic:blipFill>
-                    <a:blip r:embed="rId16"/>
+                    <a:blip r:embed="rId17"/>
                     <a:stretch>
                       <a:fillRect/>
                     </a:stretch>
@@ -1675,7 +1675,7 @@
                     <pic:cNvPicPr/>
                   </pic:nvPicPr>
                   <pic:blipFill>
-                    <a:blip r:embed="rId17"/>
+                    <a:blip r:embed="rId18"/>
                     <a:stretch>
                       <a:fillRect/>
                     </a:stretch>
@@ -1787,7 +1787,7 @@
                     <pic:cNvPicPr/>
                   </pic:nvPicPr>
                   <pic:blipFill>
-                    <a:blip r:embed="rId18"/>
+                    <a:blip r:embed="rId19"/>
                     <a:stretch>
                       <a:fillRect/>
                     </a:stretch>
@@ -1895,7 +1895,7 @@
                     <pic:cNvPicPr/>
                   </pic:nvPicPr>
                   <pic:blipFill>
-                    <a:blip r:embed="rId19"/>
+                    <a:blip r:embed="rId20"/>
                     <a:stretch>
                       <a:fillRect/>
                     </a:stretch>
@@ -1945,7 +1945,7 @@
                     <pic:cNvPicPr/>
                   </pic:nvPicPr>
                   <pic:blipFill>
-                    <a:blip r:embed="rId20"/>
+                    <a:blip r:embed="rId21"/>
                     <a:stretch>
                       <a:fillRect/>
                     </a:stretch>
@@ -2096,7 +2096,7 @@
                     <pic:cNvPicPr/>
                   </pic:nvPicPr>
                   <pic:blipFill>
-                    <a:blip r:embed="rId21"/>
+                    <a:blip r:embed="rId22"/>
                     <a:stretch>
                       <a:fillRect/>
                     </a:stretch>
@@ -2153,7 +2153,7 @@
                     <pic:cNvPicPr/>
                   </pic:nvPicPr>
                   <pic:blipFill>
-                    <a:blip r:embed="rId22"/>
+                    <a:blip r:embed="rId23"/>
                     <a:stretch>
                       <a:fillRect/>
                     </a:stretch>
@@ -2289,7 +2289,7 @@
                     <pic:cNvPicPr/>
                   </pic:nvPicPr>
                   <pic:blipFill>
-                    <a:blip r:embed="rId23"/>
+                    <a:blip r:embed="rId24"/>
                     <a:stretch>
                       <a:fillRect/>
                     </a:stretch>
@@ -2369,7 +2369,7 @@
                     <pic:cNvPicPr/>
                   </pic:nvPicPr>
                   <pic:blipFill>
-                    <a:blip r:embed="rId24"/>
+                    <a:blip r:embed="rId25"/>
                     <a:stretch>
                       <a:fillRect/>
                     </a:stretch>
@@ -2435,7 +2435,7 @@
                     <pic:cNvPicPr/>
                   </pic:nvPicPr>
                   <pic:blipFill>
-                    <a:blip r:embed="rId25"/>
+                    <a:blip r:embed="rId26"/>
                     <a:stretch>
                       <a:fillRect/>
                     </a:stretch>
@@ -2492,7 +2492,7 @@
                     <pic:cNvPicPr/>
                   </pic:nvPicPr>
                   <pic:blipFill>
-                    <a:blip r:embed="rId26"/>
+                    <a:blip r:embed="rId27"/>
                     <a:stretch>
                       <a:fillRect/>
                     </a:stretch>
@@ -2550,7 +2550,7 @@
                     <pic:cNvPicPr/>
                   </pic:nvPicPr>
                   <pic:blipFill>
-                    <a:blip r:embed="rId27"/>
+                    <a:blip r:embed="rId28"/>
                     <a:stretch>
                       <a:fillRect/>
                     </a:stretch>
@@ -2608,7 +2608,7 @@
                     <pic:cNvPicPr/>
                   </pic:nvPicPr>
                   <pic:blipFill>
-                    <a:blip r:embed="rId28"/>
+                    <a:blip r:embed="rId29"/>
                     <a:stretch>
                       <a:fillRect/>
                     </a:stretch>
@@ -2665,7 +2665,7 @@
                     <pic:cNvPicPr/>
                   </pic:nvPicPr>
                   <pic:blipFill>
-                    <a:blip r:embed="rId29"/>
+                    <a:blip r:embed="rId30"/>
                     <a:stretch>
                       <a:fillRect/>
                     </a:stretch>
@@ -2745,7 +2745,7 @@
                     <pic:cNvPicPr/>
                   </pic:nvPicPr>
                   <pic:blipFill>
-                    <a:blip r:embed="rId30"/>
+                    <a:blip r:embed="rId31"/>
                     <a:stretch>
                       <a:fillRect/>
                     </a:stretch>
@@ -2825,7 +2825,7 @@
                     <pic:cNvPicPr/>
                   </pic:nvPicPr>
                   <pic:blipFill>
-                    <a:blip r:embed="rId31"/>
+                    <a:blip r:embed="rId32"/>
                     <a:stretch>
                       <a:fillRect/>
                     </a:stretch>
@@ -2875,7 +2875,7 @@
                     <pic:cNvPicPr/>
                   </pic:nvPicPr>
                   <pic:blipFill>
-                    <a:blip r:embed="rId32"/>
+                    <a:blip r:embed="rId33"/>
                     <a:stretch>
                       <a:fillRect/>
                     </a:stretch>
@@ -2932,7 +2932,7 @@
                     <pic:cNvPicPr/>
                   </pic:nvPicPr>
                   <pic:blipFill>
-                    <a:blip r:embed="rId33"/>
+                    <a:blip r:embed="rId34"/>
                     <a:stretch>
                       <a:fillRect/>
                     </a:stretch>
@@ -3020,9 +3020,9 @@
           <w:bCs/>
         </w:rPr>
         <w:drawing>
-          <wp:inline distT="0" distB="0" distL="0" distR="0" wp14:anchorId="125BE52B" wp14:editId="4F493273">
-            <wp:extent cx="5731510" cy="3925570"/>
-            <wp:effectExtent l="0" t="0" r="2540" b="0"/>
+          <wp:inline distT="0" distB="0" distL="0" distR="0" wp14:anchorId="125BE52B" wp14:editId="6920D1AC">
+            <wp:extent cx="5264150" cy="3605470"/>
+            <wp:effectExtent l="0" t="0" r="0" b="0"/>
             <wp:docPr id="1669441263" name="Picture 1"/>
             <wp:cNvGraphicFramePr>
               <a:graphicFrameLocks xmlns:a="http://schemas.openxmlformats.org/drawingml/2006/main" noChangeAspect="1"/>
@@ -3035,7 +3035,7 @@
                     <pic:cNvPicPr/>
                   </pic:nvPicPr>
                   <pic:blipFill>
-                    <a:blip r:embed="rId34"/>
+                    <a:blip r:embed="rId35"/>
                     <a:stretch>
                       <a:fillRect/>
                     </a:stretch>
@@ -3043,7 +3043,7 @@
                   <pic:spPr>
                     <a:xfrm>
                       <a:off x="0" y="0"/>
-                      <a:ext cx="5731510" cy="3925570"/>
+                      <a:ext cx="5274790" cy="3612757"/>
                     </a:xfrm>
                     <a:prstGeom prst="rect">
                       <a:avLst/>
@@ -3076,9 +3076,8 @@
           <w:b/>
           <w:bCs/>
         </w:rPr>
-        <w:lastRenderedPageBreak/>
         <w:drawing>
-          <wp:inline distT="0" distB="0" distL="0" distR="0" wp14:anchorId="03F71123" wp14:editId="3A4AE722">
+          <wp:inline distT="0" distB="0" distL="0" distR="0" wp14:anchorId="4A3A1E96" wp14:editId="78ED84F6">
             <wp:extent cx="5731510" cy="4095750"/>
             <wp:effectExtent l="0" t="0" r="2540" b="0"/>
             <wp:docPr id="204459084" name="Picture 1"/>
@@ -3093,7 +3092,7 @@
                     <pic:cNvPicPr/>
                   </pic:nvPicPr>
                   <pic:blipFill>
-                    <a:blip r:embed="rId35"/>
+                    <a:blip r:embed="rId36"/>
                     <a:stretch>
                       <a:fillRect/>
                     </a:stretch>
@@ -3129,14 +3128,1185 @@
           <w:bCs/>
         </w:rPr>
       </w:pPr>
-    </w:p>
-    <w:p>
-      <w:pPr>
-        <w:rPr>
-          <w:b/>
-          <w:bCs/>
-        </w:rPr>
-      </w:pPr>
+      <w:r>
+        <w:rPr>
+          <w:b/>
+          <w:bCs/>
+        </w:rPr>
+        <w:t>Assignment 2:</w:t>
+      </w:r>
+    </w:p>
+    <w:p>
+      <w:pPr>
+        <w:rPr>
+          <w:b/>
+          <w:bCs/>
+        </w:rPr>
+      </w:pPr>
+      <w:r>
+        <w:rPr>
+          <w:b/>
+          <w:bCs/>
+        </w:rPr>
+        <w:t>GitHub Actions CI/CD Pipeline Flask App</w:t>
+      </w:r>
+    </w:p>
+    <w:p>
+      <w:pPr>
+        <w:rPr>
+          <w:b/>
+          <w:bCs/>
+        </w:rPr>
+      </w:pPr>
+      <w:r>
+        <w:rPr>
+          <w:b/>
+          <w:bCs/>
+        </w:rPr>
+        <w:t>Objective:</w:t>
+      </w:r>
+    </w:p>
+    <w:p>
+      <w:pPr>
+        <w:rPr>
+          <w:b/>
+          <w:bCs/>
+        </w:rPr>
+      </w:pPr>
+      <w:r>
+        <w:rPr>
+          <w:b/>
+          <w:bCs/>
+        </w:rPr>
+        <w:t>Implement a CI/CD workflow using GitHub Actions for a Python application.</w:t>
+      </w:r>
+    </w:p>
+    <w:p>
+      <w:pPr>
+        <w:rPr>
+          <w:b/>
+          <w:bCs/>
+        </w:rPr>
+      </w:pPr>
+    </w:p>
+    <w:p>
+      <w:pPr>
+        <w:rPr>
+          <w:b/>
+          <w:bCs/>
+        </w:rPr>
+      </w:pPr>
+      <w:r>
+        <w:rPr>
+          <w:b/>
+          <w:bCs/>
+        </w:rPr>
+        <w:t>continue using your existing repo:</w:t>
+      </w:r>
+    </w:p>
+    <w:p>
+      <w:pPr>
+        <w:rPr>
+          <w:b/>
+          <w:bCs/>
+        </w:rPr>
+      </w:pPr>
+      <w:r>
+        <w:rPr>
+          <w:b/>
+          <w:bCs/>
+        </w:rPr>
+        <w:t xml:space="preserve">Repository </w:t>
+      </w:r>
+      <w:proofErr w:type="gramStart"/>
+      <w:r>
+        <w:rPr>
+          <w:b/>
+          <w:bCs/>
+        </w:rPr>
+        <w:t>URL :</w:t>
+      </w:r>
+      <w:proofErr w:type="gramEnd"/>
+      <w:r>
+        <w:rPr>
+          <w:b/>
+          <w:bCs/>
+        </w:rPr>
+        <w:t xml:space="preserve"> </w:t>
+      </w:r>
+      <w:r>
+        <w:rPr>
+          <w:b/>
+          <w:bCs/>
+        </w:rPr>
+        <w:t>https://github.com/yogeshvshinde/CI-CD-Jenkins-Github.git</w:t>
+      </w:r>
+    </w:p>
+    <w:p>
+      <w:pPr>
+        <w:rPr>
+          <w:b/>
+          <w:bCs/>
+        </w:rPr>
+      </w:pPr>
+    </w:p>
+    <w:p>
+      <w:pPr>
+        <w:rPr>
+          <w:b/>
+          <w:bCs/>
+        </w:rPr>
+      </w:pPr>
+      <w:r>
+        <w:rPr>
+          <w:b/>
+          <w:bCs/>
+        </w:rPr>
+        <w:t>2. Create Required Branches</w:t>
+      </w:r>
+    </w:p>
+    <w:p>
+      <w:pPr>
+        <w:rPr>
+          <w:b/>
+          <w:bCs/>
+        </w:rPr>
+      </w:pPr>
+      <w:r>
+        <w:rPr>
+          <w:b/>
+          <w:bCs/>
+        </w:rPr>
+        <w:t xml:space="preserve"> Trigger Staging Deployment</w:t>
+      </w:r>
+    </w:p>
+    <w:p>
+      <w:pPr>
+        <w:rPr>
+          <w:b/>
+          <w:bCs/>
+        </w:rPr>
+      </w:pPr>
+      <w:r>
+        <w:rPr>
+          <w:b/>
+          <w:bCs/>
+        </w:rPr>
+        <w:t>git checkout staging</w:t>
+      </w:r>
+      <w:r>
+        <w:rPr>
+          <w:b/>
+          <w:bCs/>
+        </w:rPr>
+        <w:br/>
+        <w:t>git commit --allow-empty -m "Trigger staging"</w:t>
+      </w:r>
+      <w:r>
+        <w:rPr>
+          <w:b/>
+          <w:bCs/>
+        </w:rPr>
+        <w:br/>
+        <w:t>git push origin staging</w:t>
+      </w:r>
+    </w:p>
+    <w:p>
+      <w:pPr>
+        <w:rPr>
+          <w:b/>
+          <w:bCs/>
+        </w:rPr>
+      </w:pPr>
+      <w:r>
+        <w:rPr>
+          <w:b/>
+          <w:bCs/>
+        </w:rPr>
+        <w:t>Now</w:t>
+      </w:r>
+      <w:r>
+        <w:rPr>
+          <w:b/>
+          <w:bCs/>
+        </w:rPr>
+        <w:t xml:space="preserve"> we</w:t>
+      </w:r>
+      <w:r>
+        <w:rPr>
+          <w:b/>
+          <w:bCs/>
+        </w:rPr>
+        <w:t xml:space="preserve"> have:</w:t>
+      </w:r>
+    </w:p>
+    <w:p>
+      <w:pPr>
+        <w:numPr>
+          <w:ilvl w:val="0"/>
+          <w:numId w:val="2"/>
+        </w:numPr>
+        <w:rPr>
+          <w:b/>
+          <w:bCs/>
+        </w:rPr>
+      </w:pPr>
+      <w:r>
+        <w:rPr>
+          <w:b/>
+          <w:bCs/>
+        </w:rPr>
+        <w:t xml:space="preserve">main → production </w:t>
+      </w:r>
+    </w:p>
+    <w:p>
+      <w:pPr>
+        <w:numPr>
+          <w:ilvl w:val="0"/>
+          <w:numId w:val="2"/>
+        </w:numPr>
+        <w:rPr>
+          <w:b/>
+          <w:bCs/>
+        </w:rPr>
+      </w:pPr>
+      <w:r>
+        <w:rPr>
+          <w:b/>
+          <w:bCs/>
+        </w:rPr>
+        <w:t>staging → staging deployment</w:t>
+      </w:r>
+    </w:p>
+    <w:p>
+      <w:pPr>
+        <w:rPr>
+          <w:b/>
+          <w:bCs/>
+        </w:rPr>
+      </w:pPr>
+    </w:p>
+    <w:p>
+      <w:pPr>
+        <w:rPr>
+          <w:b/>
+          <w:bCs/>
+        </w:rPr>
+      </w:pPr>
+      <w:r>
+        <w:rPr>
+          <w:b/>
+          <w:bCs/>
+        </w:rPr>
+        <w:lastRenderedPageBreak/>
+        <w:drawing>
+          <wp:inline distT="0" distB="0" distL="0" distR="0" wp14:anchorId="2E1E998A" wp14:editId="746D7DBA">
+            <wp:extent cx="5731510" cy="3843020"/>
+            <wp:effectExtent l="0" t="0" r="2540" b="5080"/>
+            <wp:docPr id="164905187" name="Picture 1"/>
+            <wp:cNvGraphicFramePr>
+              <a:graphicFrameLocks xmlns:a="http://schemas.openxmlformats.org/drawingml/2006/main" noChangeAspect="1"/>
+            </wp:cNvGraphicFramePr>
+            <a:graphic xmlns:a="http://schemas.openxmlformats.org/drawingml/2006/main">
+              <a:graphicData uri="http://schemas.openxmlformats.org/drawingml/2006/picture">
+                <pic:pic xmlns:pic="http://schemas.openxmlformats.org/drawingml/2006/picture">
+                  <pic:nvPicPr>
+                    <pic:cNvPr id="164905187" name=""/>
+                    <pic:cNvPicPr/>
+                  </pic:nvPicPr>
+                  <pic:blipFill>
+                    <a:blip r:embed="rId37"/>
+                    <a:stretch>
+                      <a:fillRect/>
+                    </a:stretch>
+                  </pic:blipFill>
+                  <pic:spPr>
+                    <a:xfrm>
+                      <a:off x="0" y="0"/>
+                      <a:ext cx="5731510" cy="3843020"/>
+                    </a:xfrm>
+                    <a:prstGeom prst="rect">
+                      <a:avLst/>
+                    </a:prstGeom>
+                  </pic:spPr>
+                </pic:pic>
+              </a:graphicData>
+            </a:graphic>
+          </wp:inline>
+        </w:drawing>
+      </w:r>
+    </w:p>
+    <w:p>
+      <w:pPr>
+        <w:rPr>
+          <w:b/>
+          <w:bCs/>
+        </w:rPr>
+      </w:pPr>
+    </w:p>
+    <w:p>
+      <w:pPr>
+        <w:rPr>
+          <w:b/>
+          <w:bCs/>
+        </w:rPr>
+      </w:pPr>
+    </w:p>
+    <w:p>
+      <w:pPr>
+        <w:rPr>
+          <w:b/>
+          <w:bCs/>
+        </w:rPr>
+      </w:pPr>
+      <w:r>
+        <w:rPr>
+          <w:b/>
+          <w:bCs/>
+        </w:rPr>
+        <w:t xml:space="preserve">4. </w:t>
+      </w:r>
+      <w:r>
+        <w:rPr>
+          <w:b/>
+          <w:bCs/>
+        </w:rPr>
+        <w:t>Create GitHub Actions Workflow</w:t>
+      </w:r>
+    </w:p>
+    <w:p>
+      <w:pPr>
+        <w:rPr>
+          <w:b/>
+          <w:bCs/>
+          <w:sz w:val="20"/>
+          <w:szCs w:val="20"/>
+        </w:rPr>
+      </w:pPr>
+      <w:r>
+        <w:rPr>
+          <w:b/>
+          <w:bCs/>
+          <w:sz w:val="20"/>
+          <w:szCs w:val="20"/>
+        </w:rPr>
+        <w:t>Created this file:</w:t>
+      </w:r>
+    </w:p>
+    <w:p>
+      <w:pPr>
+        <w:rPr>
+          <w:b/>
+          <w:bCs/>
+        </w:rPr>
+      </w:pPr>
+    </w:p>
+    <w:p>
+      <w:pPr>
+        <w:rPr>
+          <w:b/>
+          <w:bCs/>
+        </w:rPr>
+      </w:pPr>
+      <w:r>
+        <w:rPr>
+          <w:b/>
+          <w:bCs/>
+        </w:rPr>
+        <w:lastRenderedPageBreak/>
+        <w:drawing>
+          <wp:inline distT="0" distB="0" distL="0" distR="0" wp14:anchorId="38E306C1" wp14:editId="7886FB4B">
+            <wp:extent cx="5731510" cy="5541010"/>
+            <wp:effectExtent l="0" t="0" r="2540" b="2540"/>
+            <wp:docPr id="826425780" name="Picture 1"/>
+            <wp:cNvGraphicFramePr>
+              <a:graphicFrameLocks xmlns:a="http://schemas.openxmlformats.org/drawingml/2006/main" noChangeAspect="1"/>
+            </wp:cNvGraphicFramePr>
+            <a:graphic xmlns:a="http://schemas.openxmlformats.org/drawingml/2006/main">
+              <a:graphicData uri="http://schemas.openxmlformats.org/drawingml/2006/picture">
+                <pic:pic xmlns:pic="http://schemas.openxmlformats.org/drawingml/2006/picture">
+                  <pic:nvPicPr>
+                    <pic:cNvPr id="826425780" name=""/>
+                    <pic:cNvPicPr/>
+                  </pic:nvPicPr>
+                  <pic:blipFill>
+                    <a:blip r:embed="rId38"/>
+                    <a:stretch>
+                      <a:fillRect/>
+                    </a:stretch>
+                  </pic:blipFill>
+                  <pic:spPr>
+                    <a:xfrm>
+                      <a:off x="0" y="0"/>
+                      <a:ext cx="5731510" cy="5541010"/>
+                    </a:xfrm>
+                    <a:prstGeom prst="rect">
+                      <a:avLst/>
+                    </a:prstGeom>
+                  </pic:spPr>
+                </pic:pic>
+              </a:graphicData>
+            </a:graphic>
+          </wp:inline>
+        </w:drawing>
+      </w:r>
+    </w:p>
+    <w:p>
+      <w:pPr>
+        <w:rPr>
+          <w:b/>
+          <w:bCs/>
+        </w:rPr>
+      </w:pPr>
+    </w:p>
+    <w:p>
+      <w:pPr>
+        <w:rPr>
+          <w:b/>
+          <w:bCs/>
+        </w:rPr>
+      </w:pPr>
+      <w:r>
+        <w:rPr>
+          <w:b/>
+          <w:bCs/>
+        </w:rPr>
+        <w:t xml:space="preserve">5. </w:t>
+      </w:r>
+      <w:r>
+        <w:rPr>
+          <w:b/>
+          <w:bCs/>
+        </w:rPr>
+        <w:t>Configure GitHub Secrets</w:t>
+      </w:r>
+    </w:p>
+    <w:p>
+      <w:pPr>
+        <w:rPr>
+          <w:rFonts w:ascii="Calibri" w:hAnsi="Calibri" w:cs="Calibri"/>
+          <w:b/>
+          <w:bCs/>
+          <w:sz w:val="20"/>
+          <w:szCs w:val="20"/>
+        </w:rPr>
+      </w:pPr>
+      <w:r>
+        <w:rPr>
+          <w:rFonts w:ascii="Calibri" w:hAnsi="Calibri" w:cs="Calibri"/>
+          <w:b/>
+          <w:bCs/>
+          <w:sz w:val="20"/>
+          <w:szCs w:val="20"/>
+        </w:rPr>
+        <w:t>Go to:</w:t>
+      </w:r>
+      <w:r>
+        <w:rPr>
+          <w:rFonts w:ascii="Calibri" w:hAnsi="Calibri" w:cs="Calibri"/>
+          <w:b/>
+          <w:bCs/>
+          <w:sz w:val="20"/>
+          <w:szCs w:val="20"/>
+        </w:rPr>
+        <w:br/>
+        <w:t>Repo → Settings → Secrets → Actions</w:t>
+      </w:r>
+    </w:p>
+    <w:p>
+      <w:pPr>
+        <w:rPr>
+          <w:rFonts w:ascii="Calibri" w:hAnsi="Calibri" w:cs="Calibri"/>
+          <w:b/>
+          <w:bCs/>
+          <w:sz w:val="20"/>
+          <w:szCs w:val="20"/>
+        </w:rPr>
+      </w:pPr>
+    </w:p>
+    <w:p>
+      <w:pPr>
+        <w:rPr>
+          <w:rFonts w:ascii="Calibri" w:hAnsi="Calibri" w:cs="Calibri"/>
+          <w:b/>
+          <w:bCs/>
+          <w:sz w:val="20"/>
+          <w:szCs w:val="20"/>
+        </w:rPr>
+      </w:pPr>
+      <w:r>
+        <w:rPr>
+          <w:rFonts w:ascii="Calibri" w:hAnsi="Calibri" w:cs="Calibri"/>
+          <w:b/>
+          <w:bCs/>
+          <w:sz w:val="20"/>
+          <w:szCs w:val="20"/>
+        </w:rPr>
+        <w:t>Add</w:t>
+      </w:r>
+      <w:r>
+        <w:rPr>
+          <w:rFonts w:ascii="Calibri" w:hAnsi="Calibri" w:cs="Calibri"/>
+          <w:b/>
+          <w:bCs/>
+          <w:sz w:val="20"/>
+          <w:szCs w:val="20"/>
+        </w:rPr>
+        <w:t>ed</w:t>
+      </w:r>
+      <w:r>
+        <w:rPr>
+          <w:rFonts w:ascii="Calibri" w:hAnsi="Calibri" w:cs="Calibri"/>
+          <w:b/>
+          <w:bCs/>
+          <w:sz w:val="20"/>
+          <w:szCs w:val="20"/>
+        </w:rPr>
+        <w:t>:</w:t>
+      </w:r>
+    </w:p>
+    <w:tbl>
+      <w:tblPr>
+        <w:tblW w:w="0" w:type="auto"/>
+        <w:tblCellSpacing w:w="15" w:type="dxa"/>
+        <w:tblCellMar>
+          <w:top w:w="15" w:type="dxa"/>
+          <w:left w:w="15" w:type="dxa"/>
+          <w:bottom w:w="15" w:type="dxa"/>
+          <w:right w:w="15" w:type="dxa"/>
+        </w:tblCellMar>
+        <w:tblLook w:val="04A0" w:firstRow="1" w:lastRow="0" w:firstColumn="1" w:lastColumn="0" w:noHBand="0" w:noVBand="1"/>
+      </w:tblPr>
+      <w:tblGrid>
+        <w:gridCol w:w="1363"/>
+        <w:gridCol w:w="2063"/>
+      </w:tblGrid>
+      <w:tr>
+        <w:trPr>
+          <w:tblHeader/>
+          <w:tblCellSpacing w:w="15" w:type="dxa"/>
+        </w:trPr>
+        <w:tc>
+          <w:tcPr>
+            <w:tcW w:w="0" w:type="auto"/>
+            <w:vAlign w:val="center"/>
+            <w:hideMark/>
+          </w:tcPr>
+          <w:p>
+            <w:pPr>
+              <w:rPr>
+                <w:rFonts w:ascii="Calibri" w:hAnsi="Calibri" w:cs="Calibri"/>
+                <w:b/>
+                <w:bCs/>
+                <w:sz w:val="20"/>
+                <w:szCs w:val="20"/>
+              </w:rPr>
+            </w:pPr>
+            <w:r>
+              <w:rPr>
+                <w:rFonts w:ascii="Calibri" w:hAnsi="Calibri" w:cs="Calibri"/>
+                <w:b/>
+                <w:bCs/>
+                <w:sz w:val="20"/>
+                <w:szCs w:val="20"/>
+              </w:rPr>
+              <w:t>Secret Name</w:t>
+            </w:r>
+          </w:p>
+        </w:tc>
+        <w:tc>
+          <w:tcPr>
+            <w:tcW w:w="0" w:type="auto"/>
+            <w:vAlign w:val="center"/>
+            <w:hideMark/>
+          </w:tcPr>
+          <w:p>
+            <w:pPr>
+              <w:rPr>
+                <w:rFonts w:ascii="Calibri" w:hAnsi="Calibri" w:cs="Calibri"/>
+                <w:b/>
+                <w:bCs/>
+                <w:sz w:val="20"/>
+                <w:szCs w:val="20"/>
+              </w:rPr>
+            </w:pPr>
+            <w:r>
+              <w:rPr>
+                <w:rFonts w:ascii="Calibri" w:hAnsi="Calibri" w:cs="Calibri"/>
+                <w:b/>
+                <w:bCs/>
+                <w:sz w:val="20"/>
+                <w:szCs w:val="20"/>
+              </w:rPr>
+              <w:t>Value</w:t>
+            </w:r>
+          </w:p>
+        </w:tc>
+      </w:tr>
+      <w:tr>
+        <w:trPr>
+          <w:tblCellSpacing w:w="15" w:type="dxa"/>
+        </w:trPr>
+        <w:tc>
+          <w:tcPr>
+            <w:tcW w:w="0" w:type="auto"/>
+            <w:vAlign w:val="center"/>
+            <w:hideMark/>
+          </w:tcPr>
+          <w:p>
+            <w:pPr>
+              <w:rPr>
+                <w:rFonts w:ascii="Calibri" w:hAnsi="Calibri" w:cs="Calibri"/>
+                <w:b/>
+                <w:bCs/>
+                <w:sz w:val="20"/>
+                <w:szCs w:val="20"/>
+              </w:rPr>
+            </w:pPr>
+            <w:r>
+              <w:rPr>
+                <w:rFonts w:ascii="Calibri" w:hAnsi="Calibri" w:cs="Calibri"/>
+                <w:b/>
+                <w:bCs/>
+                <w:sz w:val="20"/>
+                <w:szCs w:val="20"/>
+              </w:rPr>
+              <w:t>STAGING_HOST</w:t>
+            </w:r>
+          </w:p>
+        </w:tc>
+        <w:tc>
+          <w:tcPr>
+            <w:tcW w:w="0" w:type="auto"/>
+            <w:vAlign w:val="center"/>
+            <w:hideMark/>
+          </w:tcPr>
+          <w:p>
+            <w:pPr>
+              <w:rPr>
+                <w:rFonts w:ascii="Calibri" w:hAnsi="Calibri" w:cs="Calibri"/>
+                <w:b/>
+                <w:bCs/>
+                <w:sz w:val="20"/>
+                <w:szCs w:val="20"/>
+              </w:rPr>
+            </w:pPr>
+            <w:r>
+              <w:rPr>
+                <w:rFonts w:ascii="Calibri" w:hAnsi="Calibri" w:cs="Calibri"/>
+                <w:b/>
+                <w:bCs/>
+                <w:sz w:val="20"/>
+                <w:szCs w:val="20"/>
+              </w:rPr>
+              <w:t>Your Azure VM Public IP</w:t>
+            </w:r>
+          </w:p>
+        </w:tc>
+      </w:tr>
+      <w:tr>
+        <w:trPr>
+          <w:tblCellSpacing w:w="15" w:type="dxa"/>
+        </w:trPr>
+        <w:tc>
+          <w:tcPr>
+            <w:tcW w:w="0" w:type="auto"/>
+            <w:vAlign w:val="center"/>
+            <w:hideMark/>
+          </w:tcPr>
+          <w:p>
+            <w:pPr>
+              <w:rPr>
+                <w:rFonts w:ascii="Calibri" w:hAnsi="Calibri" w:cs="Calibri"/>
+                <w:b/>
+                <w:bCs/>
+                <w:sz w:val="20"/>
+                <w:szCs w:val="20"/>
+              </w:rPr>
+            </w:pPr>
+            <w:r>
+              <w:rPr>
+                <w:rFonts w:ascii="Calibri" w:hAnsi="Calibri" w:cs="Calibri"/>
+                <w:b/>
+                <w:bCs/>
+                <w:sz w:val="20"/>
+                <w:szCs w:val="20"/>
+              </w:rPr>
+              <w:t>STAGING_USER</w:t>
+            </w:r>
+          </w:p>
+        </w:tc>
+        <w:tc>
+          <w:tcPr>
+            <w:tcW w:w="0" w:type="auto"/>
+            <w:vAlign w:val="center"/>
+            <w:hideMark/>
+          </w:tcPr>
+          <w:p>
+            <w:pPr>
+              <w:rPr>
+                <w:rFonts w:ascii="Calibri" w:hAnsi="Calibri" w:cs="Calibri"/>
+                <w:b/>
+                <w:bCs/>
+                <w:sz w:val="20"/>
+                <w:szCs w:val="20"/>
+              </w:rPr>
+            </w:pPr>
+            <w:r>
+              <w:rPr>
+                <w:rFonts w:ascii="Calibri" w:hAnsi="Calibri" w:cs="Calibri"/>
+                <w:b/>
+                <w:bCs/>
+                <w:sz w:val="20"/>
+                <w:szCs w:val="20"/>
+              </w:rPr>
+              <w:t>ubuntu</w:t>
+            </w:r>
+          </w:p>
+        </w:tc>
+      </w:tr>
+      <w:tr>
+        <w:trPr>
+          <w:tblCellSpacing w:w="15" w:type="dxa"/>
+        </w:trPr>
+        <w:tc>
+          <w:tcPr>
+            <w:tcW w:w="0" w:type="auto"/>
+            <w:vAlign w:val="center"/>
+            <w:hideMark/>
+          </w:tcPr>
+          <w:p>
+            <w:pPr>
+              <w:rPr>
+                <w:rFonts w:ascii="Calibri" w:hAnsi="Calibri" w:cs="Calibri"/>
+                <w:b/>
+                <w:bCs/>
+                <w:sz w:val="20"/>
+                <w:szCs w:val="20"/>
+              </w:rPr>
+            </w:pPr>
+            <w:r>
+              <w:rPr>
+                <w:rFonts w:ascii="Calibri" w:hAnsi="Calibri" w:cs="Calibri"/>
+                <w:b/>
+                <w:bCs/>
+                <w:sz w:val="20"/>
+                <w:szCs w:val="20"/>
+              </w:rPr>
+              <w:t>PROD_HOST</w:t>
+            </w:r>
+          </w:p>
+        </w:tc>
+        <w:tc>
+          <w:tcPr>
+            <w:tcW w:w="0" w:type="auto"/>
+            <w:vAlign w:val="center"/>
+            <w:hideMark/>
+          </w:tcPr>
+          <w:p>
+            <w:pPr>
+              <w:rPr>
+                <w:rFonts w:ascii="Calibri" w:hAnsi="Calibri" w:cs="Calibri"/>
+                <w:b/>
+                <w:bCs/>
+                <w:sz w:val="20"/>
+                <w:szCs w:val="20"/>
+              </w:rPr>
+            </w:pPr>
+            <w:r>
+              <w:rPr>
+                <w:rFonts w:ascii="Calibri" w:hAnsi="Calibri" w:cs="Calibri"/>
+                <w:b/>
+                <w:bCs/>
+                <w:sz w:val="20"/>
+                <w:szCs w:val="20"/>
+              </w:rPr>
+              <w:t>Same VM or another</w:t>
+            </w:r>
+          </w:p>
+        </w:tc>
+      </w:tr>
+      <w:tr>
+        <w:trPr>
+          <w:tblCellSpacing w:w="15" w:type="dxa"/>
+        </w:trPr>
+        <w:tc>
+          <w:tcPr>
+            <w:tcW w:w="0" w:type="auto"/>
+            <w:vAlign w:val="center"/>
+            <w:hideMark/>
+          </w:tcPr>
+          <w:p>
+            <w:pPr>
+              <w:rPr>
+                <w:rFonts w:ascii="Calibri" w:hAnsi="Calibri" w:cs="Calibri"/>
+                <w:b/>
+                <w:bCs/>
+                <w:sz w:val="20"/>
+                <w:szCs w:val="20"/>
+              </w:rPr>
+            </w:pPr>
+            <w:r>
+              <w:rPr>
+                <w:rFonts w:ascii="Calibri" w:hAnsi="Calibri" w:cs="Calibri"/>
+                <w:b/>
+                <w:bCs/>
+                <w:sz w:val="20"/>
+                <w:szCs w:val="20"/>
+              </w:rPr>
+              <w:lastRenderedPageBreak/>
+              <w:t>PROD_USER</w:t>
+            </w:r>
+          </w:p>
+        </w:tc>
+        <w:tc>
+          <w:tcPr>
+            <w:tcW w:w="0" w:type="auto"/>
+            <w:vAlign w:val="center"/>
+            <w:hideMark/>
+          </w:tcPr>
+          <w:p>
+            <w:pPr>
+              <w:rPr>
+                <w:rFonts w:ascii="Calibri" w:hAnsi="Calibri" w:cs="Calibri"/>
+                <w:b/>
+                <w:bCs/>
+                <w:sz w:val="20"/>
+                <w:szCs w:val="20"/>
+              </w:rPr>
+            </w:pPr>
+            <w:r>
+              <w:rPr>
+                <w:rFonts w:ascii="Calibri" w:hAnsi="Calibri" w:cs="Calibri"/>
+                <w:b/>
+                <w:bCs/>
+                <w:sz w:val="20"/>
+                <w:szCs w:val="20"/>
+              </w:rPr>
+              <w:t>ubuntu</w:t>
+            </w:r>
+          </w:p>
+        </w:tc>
+      </w:tr>
+    </w:tbl>
+    <w:p>
+      <w:pPr>
+        <w:rPr>
+          <w:b/>
+          <w:bCs/>
+        </w:rPr>
+      </w:pPr>
+    </w:p>
+    <w:p>
+      <w:pPr>
+        <w:rPr>
+          <w:b/>
+          <w:bCs/>
+        </w:rPr>
+      </w:pPr>
+      <w:r>
+        <w:rPr>
+          <w:b/>
+          <w:bCs/>
+        </w:rPr>
+        <w:drawing>
+          <wp:inline distT="0" distB="0" distL="0" distR="0" wp14:anchorId="3B2EA0C5" wp14:editId="06DA81CF">
+            <wp:extent cx="5731510" cy="4124325"/>
+            <wp:effectExtent l="0" t="0" r="2540" b="9525"/>
+            <wp:docPr id="1428507852" name="Picture 1"/>
+            <wp:cNvGraphicFramePr>
+              <a:graphicFrameLocks xmlns:a="http://schemas.openxmlformats.org/drawingml/2006/main" noChangeAspect="1"/>
+            </wp:cNvGraphicFramePr>
+            <a:graphic xmlns:a="http://schemas.openxmlformats.org/drawingml/2006/main">
+              <a:graphicData uri="http://schemas.openxmlformats.org/drawingml/2006/picture">
+                <pic:pic xmlns:pic="http://schemas.openxmlformats.org/drawingml/2006/picture">
+                  <pic:nvPicPr>
+                    <pic:cNvPr id="1428507852" name=""/>
+                    <pic:cNvPicPr/>
+                  </pic:nvPicPr>
+                  <pic:blipFill>
+                    <a:blip r:embed="rId39"/>
+                    <a:stretch>
+                      <a:fillRect/>
+                    </a:stretch>
+                  </pic:blipFill>
+                  <pic:spPr>
+                    <a:xfrm>
+                      <a:off x="0" y="0"/>
+                      <a:ext cx="5731510" cy="4124325"/>
+                    </a:xfrm>
+                    <a:prstGeom prst="rect">
+                      <a:avLst/>
+                    </a:prstGeom>
+                  </pic:spPr>
+                </pic:pic>
+              </a:graphicData>
+            </a:graphic>
+          </wp:inline>
+        </w:drawing>
+      </w:r>
+    </w:p>
+    <w:p>
+      <w:pPr>
+        <w:rPr>
+          <w:b/>
+          <w:bCs/>
+        </w:rPr>
+      </w:pPr>
+    </w:p>
+    <w:p>
+      <w:pPr>
+        <w:rPr>
+          <w:b/>
+          <w:bCs/>
+        </w:rPr>
+      </w:pPr>
+    </w:p>
+    <w:p>
+      <w:pPr>
+        <w:rPr>
+          <w:b/>
+          <w:bCs/>
+        </w:rPr>
+      </w:pPr>
+      <w:r>
+        <w:rPr>
+          <w:b/>
+          <w:bCs/>
+        </w:rPr>
+        <w:t>Trigger Production Deployment</w:t>
+      </w:r>
+    </w:p>
+    <w:p>
+      <w:pPr>
+        <w:rPr>
+          <w:b/>
+          <w:bCs/>
+        </w:rPr>
+      </w:pPr>
+      <w:r>
+        <w:rPr>
+          <w:b/>
+          <w:bCs/>
+        </w:rPr>
+        <w:t>Create a release on GitHub:</w:t>
+      </w:r>
+    </w:p>
+    <w:p>
+      <w:pPr>
+        <w:numPr>
+          <w:ilvl w:val="0"/>
+          <w:numId w:val="1"/>
+        </w:numPr>
+        <w:rPr>
+          <w:b/>
+          <w:bCs/>
+        </w:rPr>
+      </w:pPr>
+      <w:r>
+        <w:rPr>
+          <w:b/>
+          <w:bCs/>
+        </w:rPr>
+        <w:t>Go to Releases → Create Release</w:t>
+      </w:r>
+    </w:p>
+    <w:p>
+      <w:pPr>
+        <w:rPr>
+          <w:b/>
+          <w:bCs/>
+        </w:rPr>
+      </w:pPr>
+      <w:r>
+        <w:rPr>
+          <w:b/>
+          <w:bCs/>
+        </w:rPr>
+        <w:lastRenderedPageBreak/>
+        <w:drawing>
+          <wp:inline distT="0" distB="0" distL="0" distR="0" wp14:anchorId="6C4A96EB" wp14:editId="381A79BF">
+            <wp:extent cx="5731510" cy="3384550"/>
+            <wp:effectExtent l="0" t="0" r="2540" b="6350"/>
+            <wp:docPr id="142592413" name="Picture 1"/>
+            <wp:cNvGraphicFramePr>
+              <a:graphicFrameLocks xmlns:a="http://schemas.openxmlformats.org/drawingml/2006/main" noChangeAspect="1"/>
+            </wp:cNvGraphicFramePr>
+            <a:graphic xmlns:a="http://schemas.openxmlformats.org/drawingml/2006/main">
+              <a:graphicData uri="http://schemas.openxmlformats.org/drawingml/2006/picture">
+                <pic:pic xmlns:pic="http://schemas.openxmlformats.org/drawingml/2006/picture">
+                  <pic:nvPicPr>
+                    <pic:cNvPr id="142592413" name=""/>
+                    <pic:cNvPicPr/>
+                  </pic:nvPicPr>
+                  <pic:blipFill>
+                    <a:blip r:embed="rId40"/>
+                    <a:stretch>
+                      <a:fillRect/>
+                    </a:stretch>
+                  </pic:blipFill>
+                  <pic:spPr>
+                    <a:xfrm>
+                      <a:off x="0" y="0"/>
+                      <a:ext cx="5731510" cy="3384550"/>
+                    </a:xfrm>
+                    <a:prstGeom prst="rect">
+                      <a:avLst/>
+                    </a:prstGeom>
+                  </pic:spPr>
+                </pic:pic>
+              </a:graphicData>
+            </a:graphic>
+          </wp:inline>
+        </w:drawing>
+      </w:r>
+    </w:p>
+    <w:p>
+      <w:pPr>
+        <w:rPr>
+          <w:b/>
+          <w:bCs/>
+        </w:rPr>
+      </w:pPr>
+    </w:p>
+    <w:p>
+      <w:pPr>
+        <w:rPr>
+          <w:b/>
+          <w:bCs/>
+        </w:rPr>
+      </w:pPr>
+      <w:r>
+        <w:rPr>
+          <w:b/>
+          <w:bCs/>
+        </w:rPr>
+        <w:t xml:space="preserve">This triggers production </w:t>
+      </w:r>
+      <w:proofErr w:type="gramStart"/>
+      <w:r>
+        <w:rPr>
+          <w:b/>
+          <w:bCs/>
+        </w:rPr>
+        <w:t>deploy</w:t>
+      </w:r>
+      <w:proofErr w:type="gramEnd"/>
+    </w:p>
+    <w:p>
+      <w:pPr>
+        <w:rPr>
+          <w:b/>
+          <w:bCs/>
+        </w:rPr>
+      </w:pPr>
+    </w:p>
+    <w:p>
+      <w:pPr>
+        <w:rPr>
+          <w:b/>
+          <w:bCs/>
+        </w:rPr>
+      </w:pPr>
+      <w:r>
+        <w:rPr>
+          <w:b/>
+          <w:bCs/>
+        </w:rPr>
+        <w:drawing>
+          <wp:inline distT="0" distB="0" distL="0" distR="0" wp14:anchorId="16194369" wp14:editId="337319C3">
+            <wp:extent cx="5731510" cy="2924175"/>
+            <wp:effectExtent l="0" t="0" r="2540" b="9525"/>
+            <wp:docPr id="140917986" name="Picture 1"/>
+            <wp:cNvGraphicFramePr>
+              <a:graphicFrameLocks xmlns:a="http://schemas.openxmlformats.org/drawingml/2006/main" noChangeAspect="1"/>
+            </wp:cNvGraphicFramePr>
+            <a:graphic xmlns:a="http://schemas.openxmlformats.org/drawingml/2006/main">
+              <a:graphicData uri="http://schemas.openxmlformats.org/drawingml/2006/picture">
+                <pic:pic xmlns:pic="http://schemas.openxmlformats.org/drawingml/2006/picture">
+                  <pic:nvPicPr>
+                    <pic:cNvPr id="140917986" name=""/>
+                    <pic:cNvPicPr/>
+                  </pic:nvPicPr>
+                  <pic:blipFill>
+                    <a:blip r:embed="rId41"/>
+                    <a:stretch>
+                      <a:fillRect/>
+                    </a:stretch>
+                  </pic:blipFill>
+                  <pic:spPr>
+                    <a:xfrm>
+                      <a:off x="0" y="0"/>
+                      <a:ext cx="5731510" cy="2924175"/>
+                    </a:xfrm>
+                    <a:prstGeom prst="rect">
+                      <a:avLst/>
+                    </a:prstGeom>
+                  </pic:spPr>
+                </pic:pic>
+              </a:graphicData>
+            </a:graphic>
+          </wp:inline>
+        </w:drawing>
+      </w:r>
+    </w:p>
+    <w:p>
+      <w:pPr>
+        <w:rPr>
+          <w:b/>
+          <w:bCs/>
+        </w:rPr>
+      </w:pPr>
+    </w:p>
+    <w:p>
+      <w:pPr>
+        <w:rPr>
+          <w:b/>
+          <w:bCs/>
+        </w:rPr>
+      </w:pPr>
+      <w:r>
+        <w:rPr>
+          <w:b/>
+          <w:bCs/>
+        </w:rPr>
+        <w:lastRenderedPageBreak/>
+        <w:drawing>
+          <wp:inline distT="0" distB="0" distL="0" distR="0" wp14:anchorId="7F0C596C" wp14:editId="17CF742E">
+            <wp:extent cx="5112013" cy="1835244"/>
+            <wp:effectExtent l="0" t="0" r="0" b="0"/>
+            <wp:docPr id="1416115483" name="Picture 1"/>
+            <wp:cNvGraphicFramePr>
+              <a:graphicFrameLocks xmlns:a="http://schemas.openxmlformats.org/drawingml/2006/main" noChangeAspect="1"/>
+            </wp:cNvGraphicFramePr>
+            <a:graphic xmlns:a="http://schemas.openxmlformats.org/drawingml/2006/main">
+              <a:graphicData uri="http://schemas.openxmlformats.org/drawingml/2006/picture">
+                <pic:pic xmlns:pic="http://schemas.openxmlformats.org/drawingml/2006/picture">
+                  <pic:nvPicPr>
+                    <pic:cNvPr id="1416115483" name=""/>
+                    <pic:cNvPicPr/>
+                  </pic:nvPicPr>
+                  <pic:blipFill>
+                    <a:blip r:embed="rId42"/>
+                    <a:stretch>
+                      <a:fillRect/>
+                    </a:stretch>
+                  </pic:blipFill>
+                  <pic:spPr>
+                    <a:xfrm>
+                      <a:off x="0" y="0"/>
+                      <a:ext cx="5112013" cy="1835244"/>
+                    </a:xfrm>
+                    <a:prstGeom prst="rect">
+                      <a:avLst/>
+                    </a:prstGeom>
+                  </pic:spPr>
+                </pic:pic>
+              </a:graphicData>
+            </a:graphic>
+          </wp:inline>
+        </w:drawing>
+      </w:r>
     </w:p>
     <w:p>
       <w:pPr>
@@ -3194,6 +4364,315 @@
     </w:sectPr>
   </w:body>
 </w:document>
+</file>
+
+<file path=word/numbering.xml><?xml version="1.0" encoding="utf-8"?>
+<w:numbering xmlns:wpc="http://schemas.microsoft.com/office/word/2010/wordprocessingCanvas" xmlns:cx="http://schemas.microsoft.com/office/drawing/2014/chartex" xmlns:cx1="http://schemas.microsoft.com/office/drawing/2015/9/8/chartex" xmlns:cx2="http://schemas.microsoft.com/office/drawing/2015/10/21/chartex" xmlns:cx3="http://schemas.microsoft.com/office/drawing/2016/5/9/chartex" xmlns:cx4="http://schemas.microsoft.com/office/drawing/2016/5/10/chartex" xmlns:cx5="http://schemas.microsoft.com/office/drawing/2016/5/11/chartex" xmlns:cx6="http://schemas.microsoft.com/office/drawing/2016/5/12/chartex" xmlns:cx7="http://schemas.microsoft.com/office/drawing/2016/5/13/chartex" xmlns:cx8="http://schemas.microsoft.com/office/drawing/2016/5/14/chartex" xmlns:mc="http://schemas.openxmlformats.org/markup-compatibility/2006" xmlns:aink="http://schemas.microsoft.com/office/drawing/2016/ink" xmlns:am3d="http://schemas.microsoft.com/office/drawing/2017/model3d" xmlns:o="urn:schemas-microsoft-com:office:office" xmlns:oel="http://schemas.microsoft.com/office/2019/extlst" xmlns:r="http://schemas.openxmlformats.org/officeDocument/2006/relationships" xmlns:m="http://schemas.openxmlformats.org/officeDocument/2006/math" xmlns:v="urn:schemas-microsoft-com:vml" xmlns:wp14="http://schemas.microsoft.com/office/word/2010/wordprocessingDrawing" xmlns:wp="http://schemas.openxmlformats.org/drawingml/2006/wordprocessingDrawing" xmlns:w10="urn:schemas-microsoft-com:office:word" xmlns:w="http://schemas.openxmlformats.org/wordprocessingml/2006/main" xmlns:w14="http://schemas.microsoft.com/office/word/2010/wordml" xmlns:w15="http://schemas.microsoft.com/office/word/2012/wordml" xmlns:w16cex="http://schemas.microsoft.com/office/word/2018/wordml/cex" xmlns:w16cid="http://schemas.microsoft.com/office/word/2016/wordml/cid" xmlns:w16="http://schemas.microsoft.com/office/word/2018/wordml" xmlns:w16du="http://schemas.microsoft.com/office/word/2023/wordml/word16du" xmlns:w16sdtdh="http://schemas.microsoft.com/office/word/2020/wordml/sdtdatahash" xmlns:w16sdtfl="http://schemas.microsoft.com/office/word/2024/wordml/sdtformatlock" xmlns:w16se="http://schemas.microsoft.com/office/word/2015/wordml/symex" xmlns:wpg="http://schemas.microsoft.com/office/word/2010/wordprocessingGroup" xmlns:wpi="http://schemas.microsoft.com/office/word/2010/wordprocessingInk" xmlns:wne="http://schemas.microsoft.com/office/word/2006/wordml" xmlns:wps="http://schemas.microsoft.com/office/word/2010/wordprocessingShape" mc:Ignorable="w14 w15 w16se w16cid w16 w16cex w16sdtdh w16sdtfl w16du wp14">
+  <w:abstractNum w:abstractNumId="0" w15:restartNumberingAfterBreak="0">
+    <w:nsid w:val="4D667D8E"/>
+    <w:multiLevelType w:val="multilevel"/>
+    <w:tmpl w:val="0D283036"/>
+    <w:lvl w:ilvl="0">
+      <w:start w:val="1"/>
+      <w:numFmt w:val="bullet"/>
+      <w:lvlText w:val=""/>
+      <w:lvlJc w:val="left"/>
+      <w:pPr>
+        <w:tabs>
+          <w:tab w:val="num" w:pos="720"/>
+        </w:tabs>
+        <w:ind w:left="720" w:hanging="360"/>
+      </w:pPr>
+      <w:rPr>
+        <w:rFonts w:ascii="Symbol" w:hAnsi="Symbol" w:hint="default"/>
+        <w:sz w:val="20"/>
+      </w:rPr>
+    </w:lvl>
+    <w:lvl w:ilvl="1" w:tentative="1">
+      <w:start w:val="1"/>
+      <w:numFmt w:val="bullet"/>
+      <w:lvlText w:val="o"/>
+      <w:lvlJc w:val="left"/>
+      <w:pPr>
+        <w:tabs>
+          <w:tab w:val="num" w:pos="1440"/>
+        </w:tabs>
+        <w:ind w:left="1440" w:hanging="360"/>
+      </w:pPr>
+      <w:rPr>
+        <w:rFonts w:ascii="Courier New" w:hAnsi="Courier New" w:hint="default"/>
+        <w:sz w:val="20"/>
+      </w:rPr>
+    </w:lvl>
+    <w:lvl w:ilvl="2" w:tentative="1">
+      <w:start w:val="1"/>
+      <w:numFmt w:val="bullet"/>
+      <w:lvlText w:val=""/>
+      <w:lvlJc w:val="left"/>
+      <w:pPr>
+        <w:tabs>
+          <w:tab w:val="num" w:pos="2160"/>
+        </w:tabs>
+        <w:ind w:left="2160" w:hanging="360"/>
+      </w:pPr>
+      <w:rPr>
+        <w:rFonts w:ascii="Wingdings" w:hAnsi="Wingdings" w:hint="default"/>
+        <w:sz w:val="20"/>
+      </w:rPr>
+    </w:lvl>
+    <w:lvl w:ilvl="3" w:tentative="1">
+      <w:start w:val="1"/>
+      <w:numFmt w:val="bullet"/>
+      <w:lvlText w:val=""/>
+      <w:lvlJc w:val="left"/>
+      <w:pPr>
+        <w:tabs>
+          <w:tab w:val="num" w:pos="2880"/>
+        </w:tabs>
+        <w:ind w:left="2880" w:hanging="360"/>
+      </w:pPr>
+      <w:rPr>
+        <w:rFonts w:ascii="Wingdings" w:hAnsi="Wingdings" w:hint="default"/>
+        <w:sz w:val="20"/>
+      </w:rPr>
+    </w:lvl>
+    <w:lvl w:ilvl="4" w:tentative="1">
+      <w:start w:val="1"/>
+      <w:numFmt w:val="bullet"/>
+      <w:lvlText w:val=""/>
+      <w:lvlJc w:val="left"/>
+      <w:pPr>
+        <w:tabs>
+          <w:tab w:val="num" w:pos="3600"/>
+        </w:tabs>
+        <w:ind w:left="3600" w:hanging="360"/>
+      </w:pPr>
+      <w:rPr>
+        <w:rFonts w:ascii="Wingdings" w:hAnsi="Wingdings" w:hint="default"/>
+        <w:sz w:val="20"/>
+      </w:rPr>
+    </w:lvl>
+    <w:lvl w:ilvl="5" w:tentative="1">
+      <w:start w:val="1"/>
+      <w:numFmt w:val="bullet"/>
+      <w:lvlText w:val=""/>
+      <w:lvlJc w:val="left"/>
+      <w:pPr>
+        <w:tabs>
+          <w:tab w:val="num" w:pos="4320"/>
+        </w:tabs>
+        <w:ind w:left="4320" w:hanging="360"/>
+      </w:pPr>
+      <w:rPr>
+        <w:rFonts w:ascii="Wingdings" w:hAnsi="Wingdings" w:hint="default"/>
+        <w:sz w:val="20"/>
+      </w:rPr>
+    </w:lvl>
+    <w:lvl w:ilvl="6" w:tentative="1">
+      <w:start w:val="1"/>
+      <w:numFmt w:val="bullet"/>
+      <w:lvlText w:val=""/>
+      <w:lvlJc w:val="left"/>
+      <w:pPr>
+        <w:tabs>
+          <w:tab w:val="num" w:pos="5040"/>
+        </w:tabs>
+        <w:ind w:left="5040" w:hanging="360"/>
+      </w:pPr>
+      <w:rPr>
+        <w:rFonts w:ascii="Wingdings" w:hAnsi="Wingdings" w:hint="default"/>
+        <w:sz w:val="20"/>
+      </w:rPr>
+    </w:lvl>
+    <w:lvl w:ilvl="7" w:tentative="1">
+      <w:start w:val="1"/>
+      <w:numFmt w:val="bullet"/>
+      <w:lvlText w:val=""/>
+      <w:lvlJc w:val="left"/>
+      <w:pPr>
+        <w:tabs>
+          <w:tab w:val="num" w:pos="5760"/>
+        </w:tabs>
+        <w:ind w:left="5760" w:hanging="360"/>
+      </w:pPr>
+      <w:rPr>
+        <w:rFonts w:ascii="Wingdings" w:hAnsi="Wingdings" w:hint="default"/>
+        <w:sz w:val="20"/>
+      </w:rPr>
+    </w:lvl>
+    <w:lvl w:ilvl="8" w:tentative="1">
+      <w:start w:val="1"/>
+      <w:numFmt w:val="bullet"/>
+      <w:lvlText w:val=""/>
+      <w:lvlJc w:val="left"/>
+      <w:pPr>
+        <w:tabs>
+          <w:tab w:val="num" w:pos="6480"/>
+        </w:tabs>
+        <w:ind w:left="6480" w:hanging="360"/>
+      </w:pPr>
+      <w:rPr>
+        <w:rFonts w:ascii="Wingdings" w:hAnsi="Wingdings" w:hint="default"/>
+        <w:sz w:val="20"/>
+      </w:rPr>
+    </w:lvl>
+  </w:abstractNum>
+  <w:abstractNum w:abstractNumId="1" w15:restartNumberingAfterBreak="0">
+    <w:nsid w:val="77647C8B"/>
+    <w:multiLevelType w:val="multilevel"/>
+    <w:tmpl w:val="44E44C22"/>
+    <w:lvl w:ilvl="0">
+      <w:start w:val="1"/>
+      <w:numFmt w:val="bullet"/>
+      <w:lvlText w:val=""/>
+      <w:lvlJc w:val="left"/>
+      <w:pPr>
+        <w:tabs>
+          <w:tab w:val="num" w:pos="720"/>
+        </w:tabs>
+        <w:ind w:left="720" w:hanging="360"/>
+      </w:pPr>
+      <w:rPr>
+        <w:rFonts w:ascii="Symbol" w:hAnsi="Symbol" w:hint="default"/>
+        <w:sz w:val="20"/>
+      </w:rPr>
+    </w:lvl>
+    <w:lvl w:ilvl="1" w:tentative="1">
+      <w:start w:val="1"/>
+      <w:numFmt w:val="bullet"/>
+      <w:lvlText w:val="o"/>
+      <w:lvlJc w:val="left"/>
+      <w:pPr>
+        <w:tabs>
+          <w:tab w:val="num" w:pos="1440"/>
+        </w:tabs>
+        <w:ind w:left="1440" w:hanging="360"/>
+      </w:pPr>
+      <w:rPr>
+        <w:rFonts w:ascii="Courier New" w:hAnsi="Courier New" w:hint="default"/>
+        <w:sz w:val="20"/>
+      </w:rPr>
+    </w:lvl>
+    <w:lvl w:ilvl="2" w:tentative="1">
+      <w:start w:val="1"/>
+      <w:numFmt w:val="bullet"/>
+      <w:lvlText w:val=""/>
+      <w:lvlJc w:val="left"/>
+      <w:pPr>
+        <w:tabs>
+          <w:tab w:val="num" w:pos="2160"/>
+        </w:tabs>
+        <w:ind w:left="2160" w:hanging="360"/>
+      </w:pPr>
+      <w:rPr>
+        <w:rFonts w:ascii="Wingdings" w:hAnsi="Wingdings" w:hint="default"/>
+        <w:sz w:val="20"/>
+      </w:rPr>
+    </w:lvl>
+    <w:lvl w:ilvl="3" w:tentative="1">
+      <w:start w:val="1"/>
+      <w:numFmt w:val="bullet"/>
+      <w:lvlText w:val=""/>
+      <w:lvlJc w:val="left"/>
+      <w:pPr>
+        <w:tabs>
+          <w:tab w:val="num" w:pos="2880"/>
+        </w:tabs>
+        <w:ind w:left="2880" w:hanging="360"/>
+      </w:pPr>
+      <w:rPr>
+        <w:rFonts w:ascii="Wingdings" w:hAnsi="Wingdings" w:hint="default"/>
+        <w:sz w:val="20"/>
+      </w:rPr>
+    </w:lvl>
+    <w:lvl w:ilvl="4" w:tentative="1">
+      <w:start w:val="1"/>
+      <w:numFmt w:val="bullet"/>
+      <w:lvlText w:val=""/>
+      <w:lvlJc w:val="left"/>
+      <w:pPr>
+        <w:tabs>
+          <w:tab w:val="num" w:pos="3600"/>
+        </w:tabs>
+        <w:ind w:left="3600" w:hanging="360"/>
+      </w:pPr>
+      <w:rPr>
+        <w:rFonts w:ascii="Wingdings" w:hAnsi="Wingdings" w:hint="default"/>
+        <w:sz w:val="20"/>
+      </w:rPr>
+    </w:lvl>
+    <w:lvl w:ilvl="5" w:tentative="1">
+      <w:start w:val="1"/>
+      <w:numFmt w:val="bullet"/>
+      <w:lvlText w:val=""/>
+      <w:lvlJc w:val="left"/>
+      <w:pPr>
+        <w:tabs>
+          <w:tab w:val="num" w:pos="4320"/>
+        </w:tabs>
+        <w:ind w:left="4320" w:hanging="360"/>
+      </w:pPr>
+      <w:rPr>
+        <w:rFonts w:ascii="Wingdings" w:hAnsi="Wingdings" w:hint="default"/>
+        <w:sz w:val="20"/>
+      </w:rPr>
+    </w:lvl>
+    <w:lvl w:ilvl="6" w:tentative="1">
+      <w:start w:val="1"/>
+      <w:numFmt w:val="bullet"/>
+      <w:lvlText w:val=""/>
+      <w:lvlJc w:val="left"/>
+      <w:pPr>
+        <w:tabs>
+          <w:tab w:val="num" w:pos="5040"/>
+        </w:tabs>
+        <w:ind w:left="5040" w:hanging="360"/>
+      </w:pPr>
+      <w:rPr>
+        <w:rFonts w:ascii="Wingdings" w:hAnsi="Wingdings" w:hint="default"/>
+        <w:sz w:val="20"/>
+      </w:rPr>
+    </w:lvl>
+    <w:lvl w:ilvl="7" w:tentative="1">
+      <w:start w:val="1"/>
+      <w:numFmt w:val="bullet"/>
+      <w:lvlText w:val=""/>
+      <w:lvlJc w:val="left"/>
+      <w:pPr>
+        <w:tabs>
+          <w:tab w:val="num" w:pos="5760"/>
+        </w:tabs>
+        <w:ind w:left="5760" w:hanging="360"/>
+      </w:pPr>
+      <w:rPr>
+        <w:rFonts w:ascii="Wingdings" w:hAnsi="Wingdings" w:hint="default"/>
+        <w:sz w:val="20"/>
+      </w:rPr>
+    </w:lvl>
+    <w:lvl w:ilvl="8" w:tentative="1">
+      <w:start w:val="1"/>
+      <w:numFmt w:val="bullet"/>
+      <w:lvlText w:val=""/>
+      <w:lvlJc w:val="left"/>
+      <w:pPr>
+        <w:tabs>
+          <w:tab w:val="num" w:pos="6480"/>
+        </w:tabs>
+        <w:ind w:left="6480" w:hanging="360"/>
+      </w:pPr>
+      <w:rPr>
+        <w:rFonts w:ascii="Wingdings" w:hAnsi="Wingdings" w:hint="default"/>
+        <w:sz w:val="20"/>
+      </w:rPr>
+    </w:lvl>
+  </w:abstractNum>
+  <w:num w:numId="1" w16cid:durableId="53282144">
+    <w:abstractNumId w:val="0"/>
+  </w:num>
+  <w:num w:numId="2" w16cid:durableId="243957617">
+    <w:abstractNumId w:val="1"/>
+  </w:num>
+</w:numbering>
 </file>
 
 <file path=word/styles.xml><?xml version="1.0" encoding="utf-8"?>

</xml_diff>